<commit_message>
Remove Apple Vision framework references, reword AI skin-analysis and refresh CV
Co-Authored-By: Claude Opus 4.8 <noreply@anthropic.com>
</commit_message>
<xml_diff>
--- a/CV_AntonHoncharov.docx
+++ b/CV_AntonHoncharov.docx
@@ -267,7 +267,7 @@
           <w:sz w:val="20"/>
           <w:szCs w:val="20"/>
         </w:rPr>
-        <w:t xml:space="preserve">Senior iOS Developer with 5+ years in iOS and 10+ years in software overall, specializing in SwiftUI, Swift Concurrency, Apple Vision, and computer-vision–driven UX. Deep experience with Clean Architecture, MVVM + Coordinator, and real-time on-device pipelines. Shipped multiple App Store apps (including products with 1.5M+ MAU) and launched several from scratch. Product-focused, calm under pressure, and consistently driving technical quality and performance.</w:t>
+        <w:t>Senior iOS Developer with 5+ years in iOS and 10+ years in software overall, specializing in SwiftUI, Swift Concurrency. Deep experience with Clean Architecture, MVVM + Coordinator, and real-time on-device pipelines. Shipped multiple App Store apps (including products with 1.5M+ MAU) and launched several from scratch. Product-focused, calm under pressure, and consistently driving technical quality and performance.</w:t>
       </w:r>
     </w:p>
     <w:p>
@@ -371,7 +371,7 @@
           <w:sz w:val="20"/>
           <w:szCs w:val="20"/>
         </w:rPr>
-        <w:t xml:space="preserve">Real-time on-device AI skin analysis (Apple Vision): </w:t>
+        <w:t>Built the iOS side of a real-time AI skin-analysis feature that renders results over the captured photo within seconds — on-device quality gating and GPU overlay rendering, with ML analysis served over the network.</w:t>
       </w:r>
       <w:r>
         <w:rPr>
@@ -382,7 +382,6 @@
           <w:sz w:val="20"/>
           <w:szCs w:val="20"/>
         </w:rPr>
-        <w:t xml:space="preserve">built a pipeline that points the iPhone at a user's face and renders skin analysis over the live photo within seconds.</w:t>
       </w:r>
     </w:p>
     <w:p>
@@ -622,7 +621,7 @@
           <w:sz w:val="19"/>
           <w:szCs w:val="19"/>
         </w:rPr>
-        <w:t xml:space="preserve">Stack: </w:t>
+        <w:t>Stack: Swift 6 (async/await, actors, AsyncThrowingStream), SwiftUI, UIKit, Clean Architecture, MVVM + Coordinator, Factory DI, Apollo GraphQL, AVFoundation, Core Graphics / Core Image, Firebase / Firestore, Amplitude, Braze.</w:t>
       </w:r>
       <w:r>
         <w:rPr>
@@ -631,7 +630,6 @@
           <w:sz w:val="19"/>
           <w:szCs w:val="19"/>
         </w:rPr>
-        <w:t xml:space="preserve">Swift 6 (async/await, actors, AsyncThrowingStream), SwiftUI, UIKit, Clean Architecture, MVVM + Coordinator, Factory DI, Apollo GraphQL, Apple Vision, AVFoundation, Core Graphics / Core Image, Firebase / Firestore, Amplitude, Braze.</w:t>
       </w:r>
     </w:p>
     <w:p>
@@ -1459,16 +1457,15 @@
           <w:sz w:val="20"/>
           <w:szCs w:val="20"/>
         </w:rPr>
-        <w:t xml:space="preserve">Zmanim</w:t>
-      </w:r>
-      <w:r>
-        <w:rPr>
-          <w:rFonts w:ascii="Arial" w:cs="Arial" w:eastAsia="Arial" w:hAnsi="Arial"/>
-          <w:color w:val="1A1A1A"/>
-          <w:sz w:val="20"/>
-          <w:szCs w:val="20"/>
-        </w:rPr>
-        <w:t xml:space="preserve"> — solo-built Jewish calendar companion app, published on the App Store (iPhone, iPad, Mac, Vision).</w:t>
+        <w:t>Zmanim — solo-built Jewish calendar companion app, published on the App Store (iPhone, iPad, Mac).</w:t>
+      </w:r>
+      <w:r>
+        <w:rPr>
+          <w:rFonts w:ascii="Arial" w:cs="Arial" w:eastAsia="Arial" w:hAnsi="Arial"/>
+          <w:color w:val="1A1A1A"/>
+          <w:sz w:val="20"/>
+          <w:szCs w:val="20"/>
+        </w:rPr>
       </w:r>
     </w:p>
     <w:p>
@@ -1570,16 +1567,15 @@
           <w:sz w:val="20"/>
           <w:szCs w:val="20"/>
         </w:rPr>
-        <w:t xml:space="preserve">iOS / Swift:  </w:t>
-      </w:r>
-      <w:r>
-        <w:rPr>
-          <w:rFonts w:ascii="Arial" w:cs="Arial" w:eastAsia="Arial" w:hAnsi="Arial"/>
-          <w:color w:val="1A1A1A"/>
-          <w:sz w:val="20"/>
-          <w:szCs w:val="20"/>
-        </w:rPr>
-        <w:t xml:space="preserve">Swift • SwiftUI • UIKit • Swift Concurrency • Combine • Apple Vision • AVFoundation • Core Image / Core Graphics • Apollo GraphQL • Firebase / Firestore</w:t>
+        <w:t>iOS / Swift:  Swift • SwiftUI • UIKit • Swift Concurrency • Combine • AVFoundation • Core Image / Core Graphics • Apollo GraphQL • Firebase / Firestore</w:t>
+      </w:r>
+      <w:r>
+        <w:rPr>
+          <w:rFonts w:ascii="Arial" w:cs="Arial" w:eastAsia="Arial" w:hAnsi="Arial"/>
+          <w:color w:val="1A1A1A"/>
+          <w:sz w:val="20"/>
+          <w:szCs w:val="20"/>
+        </w:rPr>
       </w:r>
     </w:p>
     <w:p>

</xml_diff>